<commit_message>
docs: update checklist — check off implemented tasks, add step-by-step guides for remaining items
</commit_message>
<xml_diff>
--- a/docs/Ticket-Stream-Detailed-Checklist.docx
+++ b/docs/Ticket-Stream-Detailed-Checklist.docx
@@ -75,12 +75,11 @@
         <w:ind w:left="576"/>
       </w:pPr>
       <w:r>
-        <w:rPr>
-          <w:rFonts w:ascii="Segoe UI" w:hAnsi="Segoe UI"/>
-          <w:color w:val="94A3B8"/>
-          <w:sz w:val="22"/>
-        </w:rPr>
-        <w:t>Write a concise specification detailing core features and non-goals. Define user roles (Admin, Responder, Observer) and map permissions.</w:t>
+        <w:t xml:space="preserve">   1. Create a `docs/spec.md` file at the repo root to serve as the living specification.
+   2. Write a 'Core Features' section listing what the MVP will include (incident CRUD, auth, timeline, dashboard) and a 'Non-Goals' section listing what is explicitly out of scope for v1.
+   3. Define the three user roles — Admin, Responder, Observer — and document the exact actions each role can perform (e.g., only Admin can close incidents, only Responder can be assigned).
+   4. Create a permissions matrix table mapping each API endpoint to the roles allowed to call it.
+   5. Review the spec with stakeholders and commit it before starting new feature work.</w:t>
       </w:r>
     </w:p>
     <w:p>
@@ -95,7 +94,7 @@
           <w:color w:val="00D27A"/>
           <w:sz w:val="28"/>
         </w:rPr>
-        <w:t xml:space="preserve">☐ </w:t>
+        <w:t xml:space="preserve">☑ </w:t>
       </w:r>
       <w:r>
         <w:rPr>
@@ -133,7 +132,7 @@
           <w:color w:val="00D27A"/>
           <w:sz w:val="28"/>
         </w:rPr>
-        <w:t xml:space="preserve">☐ </w:t>
+        <w:t xml:space="preserve">☑ </w:t>
       </w:r>
       <w:r>
         <w:rPr>
@@ -171,7 +170,7 @@
           <w:color w:val="00D27A"/>
           <w:sz w:val="28"/>
         </w:rPr>
-        <w:t xml:space="preserve">☐ </w:t>
+        <w:t xml:space="preserve">☑ </w:t>
       </w:r>
       <w:r>
         <w:rPr>
@@ -209,7 +208,7 @@
           <w:color w:val="00D27A"/>
           <w:sz w:val="28"/>
         </w:rPr>
-        <w:t xml:space="preserve">☐ </w:t>
+        <w:t xml:space="preserve">☑ </w:t>
       </w:r>
       <w:r>
         <w:rPr>
@@ -247,7 +246,7 @@
           <w:color w:val="00D27A"/>
           <w:sz w:val="28"/>
         </w:rPr>
-        <w:t xml:space="preserve">☐ </w:t>
+        <w:t xml:space="preserve">☑ </w:t>
       </w:r>
       <w:r>
         <w:rPr>
@@ -303,12 +302,11 @@
         <w:ind w:left="576"/>
       </w:pPr>
       <w:r>
-        <w:rPr>
-          <w:rFonts w:ascii="Segoe UI" w:hAnsi="Segoe UI"/>
-          <w:color w:val="94A3B8"/>
-          <w:sz w:val="22"/>
-        </w:rPr>
-        <w:t>Draft a Postman or Swagger collection outlining endpoints (GET/POST /api/incidents, auth routes) with expected request/response JSON formats.</w:t>
+        <w:t xml:space="preserve">   1. Install swagger-jsdoc and swagger-ui-express in the server: `npm install swagger-jsdoc swagger-ui-express --prefix server`.
+   2. Create `server/swagger.js` defining the OpenAPI 3.0 base spec (title, version, servers, security schemes).
+   3. Add `@swagger` JSDoc annotations above each route handler in the controller files, documenting request body, path params, query params, and response schemas.
+   4. In `server/app.js`, import the swagger spec and mount Swagger UI at `/api/docs` using `swaggerUi.serve` and `swaggerUi.setup()`.
+   5. Navigate to `http://localhost:5000/api/docs` to verify the UI renders all endpoints correctly, then commit the spec file.</w:t>
       </w:r>
     </w:p>
     <w:p>
@@ -342,7 +340,7 @@
           <w:color w:val="00D27A"/>
           <w:sz w:val="28"/>
         </w:rPr>
-        <w:t xml:space="preserve">☐ </w:t>
+        <w:t xml:space="preserve">☑ </w:t>
       </w:r>
       <w:r>
         <w:rPr>
@@ -380,7 +378,7 @@
           <w:color w:val="00D27A"/>
           <w:sz w:val="28"/>
         </w:rPr>
-        <w:t xml:space="preserve">☐ </w:t>
+        <w:t xml:space="preserve">☑ </w:t>
       </w:r>
       <w:r>
         <w:rPr>
@@ -418,7 +416,7 @@
           <w:color w:val="00D27A"/>
           <w:sz w:val="28"/>
         </w:rPr>
-        <w:t xml:space="preserve">☐ </w:t>
+        <w:t xml:space="preserve">☑ </w:t>
       </w:r>
       <w:r>
         <w:rPr>
@@ -456,7 +454,7 @@
           <w:color w:val="00D27A"/>
           <w:sz w:val="28"/>
         </w:rPr>
-        <w:t xml:space="preserve">☐ </w:t>
+        <w:t xml:space="preserve">☑ </w:t>
       </w:r>
       <w:r>
         <w:rPr>
@@ -494,7 +492,7 @@
           <w:color w:val="00D27A"/>
           <w:sz w:val="28"/>
         </w:rPr>
-        <w:t xml:space="preserve">☐ </w:t>
+        <w:t xml:space="preserve">☑ </w:t>
       </w:r>
       <w:r>
         <w:rPr>
@@ -532,7 +530,7 @@
           <w:color w:val="00D27A"/>
           <w:sz w:val="28"/>
         </w:rPr>
-        <w:t xml:space="preserve">☐ </w:t>
+        <w:t xml:space="preserve">☑ </w:t>
       </w:r>
       <w:r>
         <w:rPr>
@@ -570,7 +568,7 @@
           <w:color w:val="00D27A"/>
           <w:sz w:val="28"/>
         </w:rPr>
-        <w:t xml:space="preserve">☐ </w:t>
+        <w:t xml:space="preserve">☑ </w:t>
       </w:r>
       <w:r>
         <w:rPr>
@@ -608,7 +606,7 @@
           <w:color w:val="00D27A"/>
           <w:sz w:val="28"/>
         </w:rPr>
-        <w:t xml:space="preserve">☐ </w:t>
+        <w:t xml:space="preserve">☑ </w:t>
       </w:r>
       <w:r>
         <w:rPr>
@@ -665,7 +663,7 @@
           <w:color w:val="00D27A"/>
           <w:sz w:val="28"/>
         </w:rPr>
-        <w:t xml:space="preserve">☐ </w:t>
+        <w:t xml:space="preserve">☑ </w:t>
       </w:r>
       <w:r>
         <w:rPr>
@@ -703,7 +701,7 @@
           <w:color w:val="00D27A"/>
           <w:sz w:val="28"/>
         </w:rPr>
-        <w:t xml:space="preserve">☐ </w:t>
+        <w:t xml:space="preserve">☑ </w:t>
       </w:r>
       <w:r>
         <w:rPr>
@@ -741,7 +739,7 @@
           <w:color w:val="00D27A"/>
           <w:sz w:val="28"/>
         </w:rPr>
-        <w:t xml:space="preserve">☐ </w:t>
+        <w:t xml:space="preserve">☑ </w:t>
       </w:r>
       <w:r>
         <w:rPr>
@@ -779,7 +777,7 @@
           <w:color w:val="00D27A"/>
           <w:sz w:val="28"/>
         </w:rPr>
-        <w:t xml:space="preserve">☐ </w:t>
+        <w:t xml:space="preserve">☑ </w:t>
       </w:r>
       <w:r>
         <w:rPr>
@@ -817,7 +815,7 @@
           <w:color w:val="00D27A"/>
           <w:sz w:val="28"/>
         </w:rPr>
-        <w:t xml:space="preserve">☐ </w:t>
+        <w:t xml:space="preserve">☑ </w:t>
       </w:r>
       <w:r>
         <w:rPr>
@@ -855,7 +853,7 @@
           <w:color w:val="00D27A"/>
           <w:sz w:val="28"/>
         </w:rPr>
-        <w:t xml:space="preserve">☐ </w:t>
+        <w:t xml:space="preserve">☑ </w:t>
       </w:r>
       <w:r>
         <w:rPr>
@@ -912,7 +910,7 @@
           <w:color w:val="00D27A"/>
           <w:sz w:val="28"/>
         </w:rPr>
-        <w:t xml:space="preserve">☐ </w:t>
+        <w:t xml:space="preserve">☑ </w:t>
       </w:r>
       <w:r>
         <w:rPr>
@@ -950,7 +948,7 @@
           <w:color w:val="00D27A"/>
           <w:sz w:val="28"/>
         </w:rPr>
-        <w:t xml:space="preserve">☐ </w:t>
+        <w:t xml:space="preserve">☑ </w:t>
       </w:r>
       <w:r>
         <w:rPr>
@@ -1006,12 +1004,11 @@
         <w:ind w:left="576"/>
       </w:pPr>
       <w:r>
-        <w:rPr>
-          <w:rFonts w:ascii="Segoe UI" w:hAnsi="Segoe UI"/>
-          <w:color w:val="94A3B8"/>
-          <w:sz w:val="22"/>
-        </w:rPr>
-        <w:t>Update URL search parameters when users select filters. Use these parameters to trigger API fetches.</w:t>
+        <w:t xml:space="preserve">   1. Import `useSearchParams` from `react-router-dom` in `client/src/components/Pages/IncidentsDashboard.jsx`.
+   2. Replace the `filters` useState with values read from `useSearchParams`: `const [searchParams, setSearchParams] = useSearchParams()`.
+   3. Derive each filter value from the URL: e.g., `const status = searchParams.get('status') ?? ''`.
+   4. In `handleFilterChange`, call `setSearchParams({ ...Object.fromEntries(searchParams), [name]: value })` instead of updating local state.
+   5. Update the `useEffect` dependency array to watch `searchParams` so a URL change (e.g., via back/forward) triggers a fresh fetch.</w:t>
       </w:r>
     </w:p>
     <w:p>
@@ -1026,7 +1023,7 @@
           <w:color w:val="00D27A"/>
           <w:sz w:val="28"/>
         </w:rPr>
-        <w:t xml:space="preserve">☐ </w:t>
+        <w:t xml:space="preserve">☑ </w:t>
       </w:r>
       <w:r>
         <w:rPr>
@@ -1064,7 +1061,7 @@
           <w:color w:val="00D27A"/>
           <w:sz w:val="28"/>
         </w:rPr>
-        <w:t xml:space="preserve">☐ </w:t>
+        <w:t xml:space="preserve">☑ </w:t>
       </w:r>
       <w:r>
         <w:rPr>
@@ -1120,12 +1117,11 @@
         <w:ind w:left="576"/>
       </w:pPr>
       <w:r>
-        <w:rPr>
-          <w:rFonts w:ascii="Segoe UI" w:hAnsi="Segoe UI"/>
-          <w:color w:val="94A3B8"/>
-          <w:sz w:val="22"/>
-        </w:rPr>
-        <w:t>Implement `skip` and `limit` in Mongoose. Add next/previous controls and column sort headers to the React table.</w:t>
+        <w:t xml:space="preserve">   1. Add `page` (default 1) and `sort` (default `{ field: 'createdAt', dir: 'desc' }`) to the dashboard state.
+   2. Pass `page`, `sortBy`, and `sortOrder` as query parameters inside `fetchIncidents()` in `client/src/lib/incidentsApi.js`.
+   3. Render Previous / Next buttons below the incidents table; disable Previous on page 1 and Next when `page &gt;= totalPages` from the pagination response.
+   4. Add `onClick` handlers to each column `&lt;th&gt;` that toggle `sort.dir` between `asc`/`desc` and set `sort.field` to the clicked column key.
+   5. In `server/controllers/incidentController.js &gt; listIncidents`, read `req.query.sortBy` and `req.query.sortOrder` and apply them to the Mongoose `.sort()` call instead of the hard-coded `{ createdAt: -1 }`.</w:t>
       </w:r>
     </w:p>
     <w:p>
@@ -1158,12 +1154,11 @@
         <w:ind w:left="576"/>
       </w:pPr>
       <w:r>
-        <w:rPr>
-          <w:rFonts w:ascii="Segoe UI" w:hAnsi="Segoe UI"/>
-          <w:color w:val="94A3B8"/>
-          <w:sz w:val="22"/>
-        </w:rPr>
-        <w:t>Use React Query or SWR to fetch incident data, ensuring the dashboard automatically syncs status changes without manual reloads.</w:t>
+        <w:t xml:space="preserve">   1. `@tanstack/react-query` is already installed in the client. Wrap the app in `&lt;QueryClientProvider client={queryClient}&gt;` in `client/src/main.jsx`.
+   2. In `IncidentsDashboard.jsx`, replace the manual `useEffect` + `useState` fetch pattern with a `useQuery` call: `useQuery({ queryKey: ['incidents', filters], queryFn: () =&gt; fetchIncidents(fetcher, filters), refetchInterval: 30_000 })`.
+   3. Do the same for the summary endpoint with its own `useQuery` key.
+   4. After any mutation (status update, comment, assignment) in `IncidentDetails.jsx`, call `queryClient.invalidateQueries({ queryKey: ['incidents'] })` to force a background refresh.
+   5. Test by opening two browser tabs and mutating an incident in one — the other tab should update automatically within the polling interval.</w:t>
       </w:r>
     </w:p>
     <w:p>
@@ -1197,7 +1192,7 @@
           <w:color w:val="00D27A"/>
           <w:sz w:val="28"/>
         </w:rPr>
-        <w:t xml:space="preserve">☐ </w:t>
+        <w:t xml:space="preserve">☑ </w:t>
       </w:r>
       <w:r>
         <w:rPr>
@@ -1235,7 +1230,7 @@
           <w:color w:val="00D27A"/>
           <w:sz w:val="28"/>
         </w:rPr>
-        <w:t xml:space="preserve">☐ </w:t>
+        <w:t xml:space="preserve">☑ </w:t>
       </w:r>
       <w:r>
         <w:rPr>
@@ -1273,7 +1268,7 @@
           <w:color w:val="00D27A"/>
           <w:sz w:val="28"/>
         </w:rPr>
-        <w:t xml:space="preserve">☐ </w:t>
+        <w:t xml:space="preserve">☑ </w:t>
       </w:r>
       <w:r>
         <w:rPr>
@@ -1329,12 +1324,11 @@
         <w:ind w:left="576"/>
       </w:pPr>
       <w:r>
-        <w:rPr>
-          <w:rFonts w:ascii="Segoe UI" w:hAnsi="Segoe UI"/>
-          <w:color w:val="94A3B8"/>
-          <w:sz w:val="22"/>
-        </w:rPr>
-        <w:t>Add a textarea for new comments. Add a dropdown populated with eligible users for updating ownership.</w:t>
+        <w:t xml:space="preserve">   1. Fetch the list of users in the incident's company from `GET /api/users` when the detail page mounts; store them in a `users` state variable.
+   2. Replace the 'Assign to me' button with a `&lt;select&gt;` dropdown rendered from the `users` array, with each `&lt;option&gt;` showing the user's name and `value` set to their `_id`.
+   3. Pre-select the dropdown to `incident.assignee?._id` so the current assignee is shown on load.
+   4. On dropdown `onChange`, call `updateIncidentRequest(fetcher, incidentId, { assignee: selectedUserId })`, show a toast, and refresh the incident state.
+   5. Keep the comment `&lt;textarea&gt;` and submit button as-is; both features can coexist in the same detail panel.</w:t>
       </w:r>
     </w:p>
     <w:p>
@@ -1349,7 +1343,7 @@
           <w:color w:val="00D27A"/>
           <w:sz w:val="28"/>
         </w:rPr>
-        <w:t xml:space="preserve">☐ </w:t>
+        <w:t xml:space="preserve">☑ </w:t>
       </w:r>
       <w:r>
         <w:rPr>
@@ -1406,7 +1400,7 @@
           <w:color w:val="00D27A"/>
           <w:sz w:val="28"/>
         </w:rPr>
-        <w:t xml:space="preserve">☐ </w:t>
+        <w:t xml:space="preserve">☑ </w:t>
       </w:r>
       <w:r>
         <w:rPr>
@@ -1444,7 +1438,7 @@
           <w:color w:val="00D27A"/>
           <w:sz w:val="28"/>
         </w:rPr>
-        <w:t xml:space="preserve">☐ </w:t>
+        <w:t xml:space="preserve">☑ </w:t>
       </w:r>
       <w:r>
         <w:rPr>
@@ -1482,7 +1476,7 @@
           <w:color w:val="00D27A"/>
           <w:sz w:val="28"/>
         </w:rPr>
-        <w:t xml:space="preserve">☐ </w:t>
+        <w:t xml:space="preserve">☑ </w:t>
       </w:r>
       <w:r>
         <w:rPr>
@@ -1520,7 +1514,7 @@
           <w:color w:val="00D27A"/>
           <w:sz w:val="28"/>
         </w:rPr>
-        <w:t xml:space="preserve">☐ </w:t>
+        <w:t xml:space="preserve">☑ </w:t>
       </w:r>
       <w:r>
         <w:rPr>
@@ -1576,12 +1570,11 @@
         <w:ind w:left="576"/>
       </w:pPr>
       <w:r>
-        <w:rPr>
-          <w:rFonts w:ascii="Segoe UI" w:hAnsi="Segoe UI"/>
-          <w:color w:val="94A3B8"/>
-          <w:sz w:val="22"/>
-        </w:rPr>
-        <w:t>Add Helmet middleware to Express. Use mongo-sanitize to strip illegal characters and prevent NoSQL injection attacks.</w:t>
+        <w:t xml:space="preserve">   1. Helmet middleware is already applied in `server/app.js` via `app.use(helmet())` — no action needed there.
+   2. Install express-mongo-sanitize: `npm install express-mongo-sanitize --prefix server`.
+   3. In `server/app.js`, import the package: `import mongoSanitize from 'express-mongo-sanitize'`.
+   4. Add `app.use(mongoSanitize())` immediately after the `express.json()` and `express.urlencoded()` middleware lines to sanitize all incoming request bodies and query strings.
+   5. Verify by sending a test request with a payload like `{ "email": { "$gt": "" } }` and confirming the operator is stripped before reaching the controller.</w:t>
       </w:r>
     </w:p>
     <w:p>
@@ -1614,12 +1607,11 @@
         <w:ind w:left="576"/>
       </w:pPr>
       <w:r>
-        <w:rPr>
-          <w:rFonts w:ascii="Segoe UI" w:hAnsi="Segoe UI"/>
-          <w:color w:val="94A3B8"/>
-          <w:sz w:val="22"/>
-        </w:rPr>
-        <w:t>Write a multi-stage Dockerfile or define render.yaml/vercel.json. Document all required environment variables in a README.</w:t>
+        <w:t xml:space="preserve">   1. Create a `.env.example` file at the repository root listing every required environment variable with placeholder values (e.g., `MONGODB_URI=`, `JWT_SECRET=`, `PORT=5000`, `CLIENT_URL=`, `NODE_ENV=production`, `CLOUDINARY_CLOUD_NAME=`, etc.).
+   2. Write a multi-stage `Dockerfile` in the repo root: a `builder` stage that installs all dependencies and builds the client, and a `production` stage that copies only the built client and server files with production deps.
+   3. Create a `render.yaml` (for Render) or `vercel.json` (for Vercel) defining the service type, build command, start command, and required environment variable names.
+   4. Add a 'Deployment' section to `README.md` describing each environment variable, which service to use, and the deploy command or dashboard steps.
+   5. Optionally add a `docker-compose.yml` for local containerized development that spins up both the Node server and a MongoDB instance together.</w:t>
       </w:r>
     </w:p>
     <w:p>

</xml_diff>